<commit_message>
refactor: Se realizan cambios en los documentos para dar seguimiento a las actividades asignadas en Jira
</commit_message>
<xml_diff>
--- a/Documentacion/04 Modelo de Analisis.docx
+++ b/Documentacion/04 Modelo de Analisis.docx
@@ -408,7 +408,27 @@
                 <w:szCs w:val="28"/>
                 <w:lang w:val="es-EC"/>
               </w:rPr>
-              <w:t>squez, Mgtr.,</w:t>
+              <w:t xml:space="preserve">squez, </w:t>
+            </w:r>
+            <w:proofErr w:type="spellStart"/>
+            <w:r>
+              <w:rPr>
+                <w:rFonts w:ascii="Verdana" w:hAnsi="Verdana" w:cs="Times New Roman"/>
+                <w:sz w:val="28"/>
+                <w:szCs w:val="28"/>
+                <w:lang w:val="es-EC"/>
+              </w:rPr>
+              <w:t>Mgtr</w:t>
+            </w:r>
+            <w:proofErr w:type="spellEnd"/>
+            <w:r>
+              <w:rPr>
+                <w:rFonts w:ascii="Verdana" w:hAnsi="Verdana" w:cs="Times New Roman"/>
+                <w:sz w:val="28"/>
+                <w:szCs w:val="28"/>
+                <w:lang w:val="es-EC"/>
+              </w:rPr>
+              <w:t>.,</w:t>
             </w:r>
             <w:proofErr w:type="spellStart"/>
             <w:r>
@@ -13459,6 +13479,7 @@
         </w:rPr>
       </w:pPr>
       <w:bookmarkStart w:id="17" w:name="_Toc238469519"/>
+      <w:proofErr w:type="spellStart"/>
       <w:r>
         <w:rPr>
           <w:rFonts w:ascii="Verdana" w:hAnsi="Verdana"/>
@@ -13468,7 +13489,19 @@
           <w:sz w:val="22"/>
           <w:szCs w:val="22"/>
         </w:rPr>
-        <w:t xml:space="preserve">Tabla </w:t>
+        <w:t>Tabla</w:t>
+      </w:r>
+      <w:proofErr w:type="spellEnd"/>
+      <w:r>
+        <w:rPr>
+          <w:rFonts w:ascii="Verdana" w:hAnsi="Verdana"/>
+          <w:b w:val="0"/>
+          <w:bCs w:val="0"/>
+          <w:color w:val="auto"/>
+          <w:sz w:val="22"/>
+          <w:szCs w:val="22"/>
+        </w:rPr>
+        <w:t xml:space="preserve"> </w:t>
       </w:r>
       <w:r>
         <w:rPr>
@@ -14311,13 +14344,13 @@
       </w:pPr>
       <w:bookmarkStart w:id="20" w:name="_Toc238469833"/>
       <w:bookmarkStart w:id="21" w:name="_Toc238469879"/>
-      <w:bookmarkStart w:id="22" w:name="_Toc305867343"/>
-      <w:bookmarkStart w:id="23" w:name="_Toc238210819"/>
-      <w:bookmarkStart w:id="24" w:name="_Toc238293990"/>
-      <w:bookmarkStart w:id="25" w:name="_Toc238478981"/>
+      <w:bookmarkStart w:id="22" w:name="_Toc238478981"/>
+      <w:bookmarkStart w:id="23" w:name="_Toc305867343"/>
+      <w:bookmarkStart w:id="24" w:name="_Toc238210819"/>
+      <w:bookmarkStart w:id="25" w:name="_Toc238293990"/>
       <w:bookmarkEnd w:id="20"/>
       <w:bookmarkEnd w:id="21"/>
-      <w:bookmarkEnd w:id="25"/>
+      <w:bookmarkEnd w:id="22"/>
     </w:p>
     <w:p>
       <w:pPr>
@@ -14387,7 +14420,7 @@
         <w:lastRenderedPageBreak/>
         <w:t xml:space="preserve">Diagrama de </w:t>
       </w:r>
-      <w:bookmarkEnd w:id="22"/>
+      <w:bookmarkEnd w:id="23"/>
       <w:r>
         <w:rPr>
           <w:rStyle w:val="nfasisintenso"/>
@@ -14400,8 +14433,8 @@
         </w:rPr>
         <w:t>contexto</w:t>
       </w:r>
-      <w:bookmarkEnd w:id="23"/>
       <w:bookmarkEnd w:id="24"/>
+      <w:bookmarkEnd w:id="25"/>
       <w:bookmarkEnd w:id="26"/>
     </w:p>
     <w:p>
@@ -15543,6 +15576,7 @@
         </w:rPr>
       </w:pPr>
       <w:bookmarkStart w:id="31" w:name="_Toc238469521"/>
+      <w:proofErr w:type="spellStart"/>
       <w:r>
         <w:rPr>
           <w:rFonts w:ascii="Verdana" w:hAnsi="Verdana"/>
@@ -15552,7 +15586,19 @@
           <w:sz w:val="22"/>
           <w:szCs w:val="22"/>
         </w:rPr>
-        <w:t xml:space="preserve">Tabla </w:t>
+        <w:t>Tabla</w:t>
+      </w:r>
+      <w:proofErr w:type="spellEnd"/>
+      <w:r>
+        <w:rPr>
+          <w:rFonts w:ascii="Verdana" w:hAnsi="Verdana"/>
+          <w:b w:val="0"/>
+          <w:bCs w:val="0"/>
+          <w:color w:val="000000" w:themeColor="text1"/>
+          <w:sz w:val="22"/>
+          <w:szCs w:val="22"/>
+        </w:rPr>
+        <w:t xml:space="preserve"> </w:t>
       </w:r>
       <w:r>
         <w:rPr>
@@ -17948,6 +17994,7 @@
         </w:rPr>
       </w:pPr>
       <w:bookmarkStart w:id="46" w:name="_Toc238469523"/>
+      <w:proofErr w:type="spellStart"/>
       <w:r>
         <w:rPr>
           <w:rFonts w:ascii="Verdana" w:hAnsi="Verdana"/>
@@ -17957,7 +18004,19 @@
           <w:sz w:val="22"/>
           <w:szCs w:val="22"/>
         </w:rPr>
-        <w:t xml:space="preserve">Tabla </w:t>
+        <w:t>Tabla</w:t>
+      </w:r>
+      <w:proofErr w:type="spellEnd"/>
+      <w:r>
+        <w:rPr>
+          <w:rFonts w:ascii="Verdana" w:hAnsi="Verdana"/>
+          <w:b w:val="0"/>
+          <w:bCs w:val="0"/>
+          <w:color w:val="000000" w:themeColor="text1"/>
+          <w:sz w:val="22"/>
+          <w:szCs w:val="22"/>
+        </w:rPr>
+        <w:t xml:space="preserve"> </w:t>
       </w:r>
       <w:r>
         <w:rPr>
@@ -18631,6 +18690,7 @@
         </w:rPr>
       </w:pPr>
       <w:bookmarkStart w:id="48" w:name="_Toc238469524"/>
+      <w:proofErr w:type="spellStart"/>
       <w:r>
         <w:rPr>
           <w:rFonts w:ascii="Verdana" w:hAnsi="Verdana"/>
@@ -18640,7 +18700,19 @@
           <w:sz w:val="22"/>
           <w:szCs w:val="22"/>
         </w:rPr>
-        <w:t xml:space="preserve">Tabla </w:t>
+        <w:t>Tabla</w:t>
+      </w:r>
+      <w:proofErr w:type="spellEnd"/>
+      <w:r>
+        <w:rPr>
+          <w:rFonts w:ascii="Verdana" w:hAnsi="Verdana"/>
+          <w:b w:val="0"/>
+          <w:bCs w:val="0"/>
+          <w:color w:val="000000" w:themeColor="text1"/>
+          <w:sz w:val="22"/>
+          <w:szCs w:val="22"/>
+        </w:rPr>
+        <w:t xml:space="preserve"> </w:t>
       </w:r>
       <w:r>
         <w:rPr>
@@ -19256,6 +19328,7 @@
         </w:rPr>
       </w:pPr>
       <w:bookmarkStart w:id="50" w:name="_Toc238469525"/>
+      <w:proofErr w:type="spellStart"/>
       <w:r>
         <w:rPr>
           <w:rFonts w:ascii="Verdana" w:hAnsi="Verdana"/>
@@ -19265,7 +19338,19 @@
           <w:sz w:val="22"/>
           <w:szCs w:val="22"/>
         </w:rPr>
-        <w:t xml:space="preserve">Tabla </w:t>
+        <w:t>Tabla</w:t>
+      </w:r>
+      <w:proofErr w:type="spellEnd"/>
+      <w:r>
+        <w:rPr>
+          <w:rFonts w:ascii="Verdana" w:hAnsi="Verdana"/>
+          <w:b w:val="0"/>
+          <w:bCs w:val="0"/>
+          <w:color w:val="000000" w:themeColor="text1"/>
+          <w:sz w:val="22"/>
+          <w:szCs w:val="22"/>
+        </w:rPr>
+        <w:t xml:space="preserve"> </w:t>
       </w:r>
       <w:r>
         <w:rPr>
@@ -19648,12 +19733,12 @@
       </w:pPr>
       <w:bookmarkStart w:id="52" w:name="_Toc238469845"/>
       <w:bookmarkStart w:id="53" w:name="_Toc238469890"/>
-      <w:bookmarkStart w:id="54" w:name="_Toc238210824"/>
-      <w:bookmarkStart w:id="55" w:name="_Toc238293995"/>
-      <w:bookmarkStart w:id="56" w:name="_Toc238478992"/>
+      <w:bookmarkStart w:id="54" w:name="_Toc238478992"/>
+      <w:bookmarkStart w:id="55" w:name="_Toc238210824"/>
+      <w:bookmarkStart w:id="56" w:name="_Toc238293995"/>
       <w:bookmarkEnd w:id="52"/>
       <w:bookmarkEnd w:id="53"/>
-      <w:bookmarkEnd w:id="56"/>
+      <w:bookmarkEnd w:id="54"/>
     </w:p>
     <w:p>
       <w:pPr>
@@ -19734,8 +19819,8 @@
         </w:rPr>
         <w:t>Modelo conceptual del dominio</w:t>
       </w:r>
-      <w:bookmarkEnd w:id="54"/>
       <w:bookmarkEnd w:id="55"/>
+      <w:bookmarkEnd w:id="56"/>
       <w:bookmarkEnd w:id="59"/>
     </w:p>
     <w:p>
@@ -20507,6 +20592,7 @@
         </w:rPr>
       </w:pPr>
       <w:bookmarkStart w:id="64" w:name="_Toc238469526"/>
+      <w:proofErr w:type="spellStart"/>
       <w:r>
         <w:rPr>
           <w:rFonts w:ascii="Verdana" w:hAnsi="Verdana"/>
@@ -20516,7 +20602,19 @@
           <w:sz w:val="22"/>
           <w:szCs w:val="22"/>
         </w:rPr>
-        <w:t xml:space="preserve">Tabla </w:t>
+        <w:t>Tabla</w:t>
+      </w:r>
+      <w:proofErr w:type="spellEnd"/>
+      <w:r>
+        <w:rPr>
+          <w:rFonts w:ascii="Verdana" w:hAnsi="Verdana"/>
+          <w:b w:val="0"/>
+          <w:bCs w:val="0"/>
+          <w:color w:val="000000" w:themeColor="text1"/>
+          <w:sz w:val="22"/>
+          <w:szCs w:val="22"/>
+        </w:rPr>
+        <w:t xml:space="preserve"> </w:t>
       </w:r>
       <w:r>
         <w:rPr>
@@ -22293,6 +22391,10 @@
     </w:p>
     <w:p>
       <w:pPr>
+        <w:numPr>
+          <w:ilvl w:val="0"/>
+          <w:numId w:val="22"/>
+        </w:numPr>
         <w:spacing w:after="0"/>
         <w:jc w:val="both"/>
         <w:rPr>
@@ -22308,6 +22410,25 @@
           <w:lang w:val="es-EC"/>
         </w:rPr>
         <w:lastRenderedPageBreak/>
+        <w:t>Como parte de la revisión del Sprint 2, se verificó la consistencia de las entidades del dominio, relaciones principales y cardinalidades, dejando el modelo conceptual preparado como base para el diseño textual y gráfico del modelo de clases.</w:t>
+      </w:r>
+    </w:p>
+    <w:p>
+      <w:pPr>
+        <w:spacing w:after="0"/>
+        <w:jc w:val="both"/>
+        <w:rPr>
+          <w:rFonts w:ascii="Verdana" w:eastAsiaTheme="majorEastAsia" w:hAnsi="Verdana" w:cstheme="majorBidi"/>
+          <w:color w:val="000000" w:themeColor="text1"/>
+          <w:lang w:val="es-EC"/>
+        </w:rPr>
+      </w:pPr>
+      <w:r>
+        <w:rPr>
+          <w:rFonts w:ascii="Verdana" w:eastAsiaTheme="majorEastAsia" w:hAnsi="Verdana" w:cstheme="majorBidi"/>
+          <w:color w:val="000000" w:themeColor="text1"/>
+          <w:lang w:val="es-EC"/>
+        </w:rPr>
         <w:t>Este modelo constituye la base conceptual para el diseño posterior de clases, componentes y estructuras de datos, sin establecer todavía decisiones técnicas de implementación.</w:t>
       </w:r>
     </w:p>

</xml_diff>